<commit_message>
Add LTDEV-2 staging troubleshooting, log examples, RabbitMQ installer and NLog updates
Co-Authored-By: Claude Opus 5.5 <noreply@anthropic.com>
</commit_message>
<xml_diff>
--- a/LTDEV-2 - Passo a passo de configuração (valores do teste).docx
+++ b/LTDEV-2 - Passo a passo de configuração (valores do teste).docx
@@ -181,9 +181,12 @@
     </w:p>
     <w:p>
       <w:pPr>
-        <w:pStyle w:val="ListNumber"/>
         <w:spacing w:after="40"/>
+        <w:ind w:left="510" w:hanging="283"/>
       </w:pPr>
+      <w:r>
+        <w:t xml:space="preserve">1. </w:t>
+      </w:r>
       <w:r>
         <w:t xml:space="preserve">Fazer </w:t>
       </w:r>
@@ -200,9 +203,12 @@
     </w:p>
     <w:p>
       <w:pPr>
-        <w:pStyle w:val="ListNumber"/>
         <w:spacing w:after="40"/>
+        <w:ind w:left="510" w:hanging="283"/>
       </w:pPr>
+      <w:r>
+        <w:t xml:space="preserve">2. </w:t>
+      </w:r>
       <w:r>
         <w:t xml:space="preserve">Fechar o Visual Studio e apagar as pastas </w:t>
       </w:r>
@@ -239,9 +245,12 @@
     </w:p>
     <w:p>
       <w:pPr>
-        <w:pStyle w:val="ListNumber"/>
         <w:spacing w:after="40"/>
+        <w:ind w:left="510" w:hanging="283"/>
       </w:pPr>
+      <w:r>
+        <w:t xml:space="preserve">3. </w:t>
+      </w:r>
       <w:r>
         <w:t xml:space="preserve">Abrir </w:t>
       </w:r>
@@ -1471,6 +1480,19 @@
               </w:rPr>
               <w:t>ConnectionStrings.DefaultConnection</w:t>
             </w:r>
+            <w:r>
+              <w:t xml:space="preserve"> (ou </w:t>
+            </w:r>
+            <w:r>
+              <w:rPr>
+                <w:rFonts w:ascii="Consolas" w:hAnsi="Consolas"/>
+                <w:sz w:val="19"/>
+              </w:rPr>
+              <w:t>BRSCloudConnection</w:t>
+            </w:r>
+            <w:r>
+              <w:t>)</w:t>
+            </w:r>
           </w:p>
         </w:tc>
         <w:tc>
@@ -1485,6 +1507,39 @@
                 <w:sz w:val="19"/>
               </w:rPr>
               <w:t>Server=localhost;Database=CarolOneCrawfordDB;Integrated Security=true</w:t>
+            </w:r>
+            <w:r>
+              <w:t xml:space="preserve">. Pode vir em </w:t>
+            </w:r>
+            <w:r>
+              <w:rPr>
+                <w:rFonts w:ascii="Consolas" w:hAnsi="Consolas"/>
+                <w:sz w:val="19"/>
+              </w:rPr>
+              <w:t>BRSCloudConnection</w:t>
+            </w:r>
+            <w:r>
+              <w:t xml:space="preserve">, padrão dos Service-*: sem </w:t>
+            </w:r>
+            <w:r>
+              <w:rPr>
+                <w:rFonts w:ascii="Consolas" w:hAnsi="Consolas"/>
+                <w:sz w:val="19"/>
+              </w:rPr>
+              <w:t>DefaultConnection</w:t>
+            </w:r>
+            <w:r>
+              <w:t xml:space="preserve">, o serviço usa </w:t>
+            </w:r>
+            <w:r>
+              <w:rPr>
+                <w:rFonts w:ascii="Consolas" w:hAnsi="Consolas"/>
+                <w:sz w:val="19"/>
+              </w:rPr>
+              <w:t>BRSCloudConnection</w:t>
+            </w:r>
+            <w:r>
+              <w:t>. Os nomes das chaves precisam ser exatamente esses</w:t>
             </w:r>
           </w:p>
         </w:tc>
@@ -1668,7 +1723,7 @@
           <w:p>
             <w:r/>
             <w:r>
-              <w:t>vazio no arquivo; a senha vai no User Secrets (passo 6)</w:t>
+              <w:t>vazio no arquivo; vai no User Secrets em Development; no servidor, criptografado com DPAPI (passo 6)</w:t>
             </w:r>
           </w:p>
         </w:tc>
@@ -2188,7 +2243,7 @@
           <w:p>
             <w:r/>
             <w:r>
-              <w:t>vazio no arquivo; vai no User Secrets (passo 6)</w:t>
+              <w:t>em Development, vazio e no User Secrets; no servidor, criptografado com DPAPI no appsettings (passo 6)</w:t>
             </w:r>
           </w:p>
         </w:tc>
@@ -2636,6 +2691,272 @@
     </w:p>
     <w:p>
       <w:pPr>
+        <w:spacing w:after="120"/>
+      </w:pPr>
+      <w:r>
+        <w:rPr>
+          <w:b/>
+        </w:rPr>
+        <w:t>No servidor (staging/produção):</w:t>
+      </w:r>
+      <w:r>
+        <w:t xml:space="preserve"> os segredos ficam no próprio </w:t>
+      </w:r>
+      <w:r>
+        <w:rPr>
+          <w:rFonts w:ascii="Consolas" w:hAnsi="Consolas"/>
+          <w:sz w:val="19"/>
+        </w:rPr>
+        <w:t>appsettings.json</w:t>
+      </w:r>
+      <w:r>
+        <w:t xml:space="preserve">, </w:t>
+      </w:r>
+      <w:r>
+        <w:rPr>
+          <w:b/>
+        </w:rPr>
+        <w:t>criptografados com DPAPI na máquina que roda o serviço</w:t>
+      </w:r>
+      <w:r>
+        <w:t xml:space="preserve"> (valor começando com </w:t>
+      </w:r>
+      <w:r>
+        <w:rPr>
+          <w:rFonts w:ascii="Consolas" w:hAnsi="Consolas"/>
+          <w:sz w:val="19"/>
+        </w:rPr>
+        <w:t>AQAAANCM</w:t>
+      </w:r>
+      <w:r>
+        <w:t xml:space="preserve">), conforme </w:t>
+      </w:r>
+      <w:r>
+        <w:rPr>
+          <w:b/>
+        </w:rPr>
+        <w:t>LTDEV-2 - Criptografar o ClientSecret.txt</w:t>
+      </w:r>
+      <w:r>
+        <w:t>. Valor criptografado em outra máquina não abre.</w:t>
+      </w:r>
+    </w:p>
+    <w:p>
+      <w:pPr>
+        <w:pStyle w:val="Heading2"/>
+      </w:pPr>
+      <w:r>
+        <w:rPr>
+          <w:rFonts w:ascii="Calibri" w:hAnsi="Calibri"/>
+          <w:color w:val="1F3A5F"/>
+        </w:rPr>
+        <w:t>6.1 NLog.config (log em arquivo e no LogDB)</w:t>
+      </w:r>
+    </w:p>
+    <w:p>
+      <w:pPr>
+        <w:spacing w:after="120"/>
+      </w:pPr>
+      <w:r>
+        <w:t xml:space="preserve">O </w:t>
+      </w:r>
+      <w:r>
+        <w:rPr>
+          <w:rFonts w:ascii="Consolas" w:hAnsi="Consolas"/>
+          <w:sz w:val="19"/>
+        </w:rPr>
+        <w:t>NLog.config</w:t>
+      </w:r>
+      <w:r>
+        <w:t xml:space="preserve"> não é versionado. Usar o arquivo enviado junto (</w:t>
+      </w:r>
+      <w:r>
+        <w:rPr>
+          <w:b/>
+        </w:rPr>
+        <w:t>LTDEV-2 NLog staging.config</w:t>
+      </w:r>
+      <w:r>
+        <w:t xml:space="preserve"> no staging), copiado para a pasta do </w:t>
+      </w:r>
+      <w:r>
+        <w:rPr>
+          <w:rFonts w:ascii="Consolas" w:hAnsi="Consolas"/>
+          <w:sz w:val="19"/>
+        </w:rPr>
+        <w:t>.exe</w:t>
+      </w:r>
+      <w:r>
+        <w:t xml:space="preserve"> com o nome </w:t>
+      </w:r>
+      <w:r>
+        <w:rPr>
+          <w:rFonts w:ascii="Consolas" w:hAnsi="Consolas"/>
+          <w:sz w:val="19"/>
+        </w:rPr>
+        <w:t>NLog.config</w:t>
+      </w:r>
+      <w:r>
+        <w:t>. Ele segue o padrão dos outros Service-*:</w:t>
+      </w:r>
+    </w:p>
+    <w:p>
+      <w:pPr>
+        <w:pStyle w:val="ListBullet"/>
+        <w:spacing w:after="40"/>
+      </w:pPr>
+      <w:r>
+        <w:t xml:space="preserve">banco: </w:t>
+      </w:r>
+      <w:r>
+        <w:rPr>
+          <w:rFonts w:ascii="Consolas" w:hAnsi="Consolas"/>
+          <w:sz w:val="19"/>
+        </w:rPr>
+        <w:t>LogDB.dbo.Logs</w:t>
+      </w:r>
+      <w:r>
+        <w:t xml:space="preserve">, pela </w:t>
+      </w:r>
+      <w:r>
+        <w:rPr>
+          <w:rFonts w:ascii="Consolas" w:hAnsi="Consolas"/>
+          <w:sz w:val="19"/>
+        </w:rPr>
+        <w:t>ConnectionStrings.LogConnection</w:t>
+      </w:r>
+      <w:r>
+        <w:t xml:space="preserve">, com </w:t>
+      </w:r>
+      <w:r>
+        <w:rPr>
+          <w:rFonts w:ascii="Consolas" w:hAnsi="Consolas"/>
+          <w:sz w:val="19"/>
+        </w:rPr>
+        <w:t>ServiceName</w:t>
+      </w:r>
+      <w:r>
+        <w:t xml:space="preserve"> fixo (</w:t>
+      </w:r>
+      <w:r>
+        <w:rPr>
+          <w:rFonts w:ascii="Consolas" w:hAnsi="Consolas"/>
+          <w:sz w:val="19"/>
+        </w:rPr>
+        <w:t>Staging EmailIndexingService</w:t>
+      </w:r>
+      <w:r>
+        <w:t xml:space="preserve"> no staging);</w:t>
+      </w:r>
+    </w:p>
+    <w:p>
+      <w:pPr>
+        <w:pStyle w:val="ListBullet"/>
+        <w:spacing w:after="40"/>
+      </w:pPr>
+      <w:r>
+        <w:t xml:space="preserve">arquivo: </w:t>
+      </w:r>
+      <w:r>
+        <w:rPr>
+          <w:rFonts w:ascii="Consolas" w:hAnsi="Consolas"/>
+          <w:sz w:val="19"/>
+        </w:rPr>
+        <w:t>${currentdir}\log\emailindexing-AAAA-MM-DD.log</w:t>
+      </w:r>
+      <w:r>
+        <w:t xml:space="preserve">. Como serviço do Windows, o diretório atual é a pasta do </w:t>
+      </w:r>
+      <w:r>
+        <w:rPr>
+          <w:rFonts w:ascii="Consolas" w:hAnsi="Consolas"/>
+          <w:sz w:val="19"/>
+        </w:rPr>
+        <w:t>.exe</w:t>
+      </w:r>
+      <w:r>
+        <w:t xml:space="preserve">; rodando na mão, abrir o prompt na pasta do </w:t>
+      </w:r>
+      <w:r>
+        <w:rPr>
+          <w:rFonts w:ascii="Consolas" w:hAnsi="Consolas"/>
+          <w:sz w:val="19"/>
+        </w:rPr>
+        <w:t>.exe</w:t>
+      </w:r>
+      <w:r>
+        <w:t>;</w:t>
+      </w:r>
+    </w:p>
+    <w:p>
+      <w:pPr>
+        <w:pStyle w:val="ListBullet"/>
+        <w:spacing w:after="40"/>
+      </w:pPr>
+      <w:r>
+        <w:t xml:space="preserve">os nomes em </w:t>
+      </w:r>
+      <w:r>
+        <w:rPr>
+          <w:rFonts w:ascii="Consolas" w:hAnsi="Consolas"/>
+          <w:sz w:val="19"/>
+        </w:rPr>
+        <w:t>writeTo</w:t>
+      </w:r>
+      <w:r>
+        <w:t xml:space="preserve"> precisam ser os mesmos dos </w:t>
+      </w:r>
+      <w:r>
+        <w:rPr>
+          <w:rFonts w:ascii="Consolas" w:hAnsi="Consolas"/>
+          <w:sz w:val="19"/>
+        </w:rPr>
+        <w:t>&lt;target name&gt;</w:t>
+      </w:r>
+      <w:r>
+        <w:t>, senão o NLog não grava nada;</w:t>
+      </w:r>
+    </w:p>
+    <w:p>
+      <w:pPr>
+        <w:pStyle w:val="ListBullet"/>
+        <w:spacing w:after="40"/>
+      </w:pPr>
+      <w:r>
+        <w:t xml:space="preserve">não usar a extensão </w:t>
+      </w:r>
+      <w:r>
+        <w:rPr>
+          <w:rFonts w:ascii="Consolas" w:hAnsi="Consolas"/>
+          <w:sz w:val="19"/>
+        </w:rPr>
+        <w:t>NLog.Web.AspNetCore</w:t>
+      </w:r>
+      <w:r>
+        <w:t xml:space="preserve"> (o serviço não é ASP.NET);</w:t>
+      </w:r>
+    </w:p>
+    <w:p>
+      <w:pPr>
+        <w:pStyle w:val="ListBullet"/>
+        <w:spacing w:after="40"/>
+      </w:pPr>
+      <w:r>
+        <w:t xml:space="preserve">se nada for gravado, o motivo fica em </w:t>
+      </w:r>
+      <w:r>
+        <w:rPr>
+          <w:rFonts w:ascii="Consolas" w:hAnsi="Consolas"/>
+          <w:sz w:val="19"/>
+        </w:rPr>
+        <w:t>log\internal-nlog.txt</w:t>
+      </w:r>
+      <w:r>
+        <w:t>.</w:t>
+      </w:r>
+    </w:p>
+    <w:p>
+      <w:pPr>
         <w:pStyle w:val="Heading1"/>
       </w:pPr>
       <w:r>
@@ -2648,9 +2969,12 @@
     </w:p>
     <w:p>
       <w:pPr>
-        <w:pStyle w:val="ListNumber"/>
         <w:spacing w:after="40"/>
+        <w:ind w:left="510" w:hanging="283"/>
       </w:pPr>
+      <w:r>
+        <w:t xml:space="preserve">1. </w:t>
+      </w:r>
       <w:r>
         <w:t xml:space="preserve">Definir </w:t>
       </w:r>
@@ -2675,9 +2999,12 @@
     </w:p>
     <w:p>
       <w:pPr>
-        <w:pStyle w:val="ListNumber"/>
         <w:spacing w:after="40"/>
+        <w:ind w:left="510" w:hanging="283"/>
       </w:pPr>
+      <w:r>
+        <w:t xml:space="preserve">2. </w:t>
+      </w:r>
       <w:r>
         <w:t xml:space="preserve">De um endereço </w:t>
       </w:r>
@@ -2703,9 +3030,12 @@
     </w:p>
     <w:p>
       <w:pPr>
-        <w:pStyle w:val="ListNumber"/>
         <w:spacing w:after="40"/>
+        <w:ind w:left="510" w:hanging="283"/>
       </w:pPr>
+      <w:r>
+        <w:t xml:space="preserve">3. </w:t>
+      </w:r>
       <w:r>
         <w:t>Após a varredura, conferir:</w:t>
       </w:r>
@@ -2756,7 +3086,63 @@
         <w:t>.msg</w:t>
       </w:r>
       <w:r>
-        <w:t xml:space="preserve"> está na pasta de E-mails do sinistro e o anexo na de Documentos</w:t>
+        <w:t xml:space="preserve"> está na pasta de E-mails do sinistro com o </w:t>
+      </w:r>
+      <w:r>
+        <w:rPr>
+          <w:b/>
+        </w:rPr>
+        <w:t>assunto</w:t>
+      </w:r>
+      <w:r>
+        <w:t xml:space="preserve"> como nome, e o anexo na de Documentos com o nome original</w:t>
+      </w:r>
+    </w:p>
+    <w:p>
+      <w:pPr>
+        <w:spacing w:after="40"/>
+        <w:ind w:left="227"/>
+      </w:pPr>
+      <w:r>
+        <w:rPr>
+          <w:sz w:val="24"/>
+        </w:rPr>
+        <w:t xml:space="preserve">☐  </w:t>
+      </w:r>
+      <w:r>
+        <w:t>A descrição dos dois traz a data e hora do recebimento (dd/mm/aaaa hh:mm:ss)</w:t>
+      </w:r>
+    </w:p>
+    <w:p>
+      <w:pPr>
+        <w:spacing w:after="40"/>
+        <w:ind w:left="227"/>
+      </w:pPr>
+      <w:r>
+        <w:rPr>
+          <w:sz w:val="24"/>
+        </w:rPr>
+        <w:t xml:space="preserve">☐  </w:t>
+      </w:r>
+      <w:r>
+        <w:t xml:space="preserve">O log tem a linha </w:t>
+      </w:r>
+      <w:r>
+        <w:rPr>
+          <w:rFonts w:ascii="Consolas" w:hAnsi="Consolas"/>
+          <w:sz w:val="19"/>
+        </w:rPr>
+        <w:t>Scan: read=... indexed=...</w:t>
+      </w:r>
+      <w:r>
+        <w:t xml:space="preserve"> no arquivo e na </w:t>
+      </w:r>
+      <w:r>
+        <w:rPr>
+          <w:rFonts w:ascii="Consolas" w:hAnsi="Consolas"/>
+          <w:sz w:val="19"/>
+        </w:rPr>
+        <w:t>dbo.Logs</w:t>
       </w:r>
     </w:p>
     <w:p>
@@ -2804,6 +3190,127 @@
       </w:r>
       <w:r>
         <w:t>.</w:t>
+      </w:r>
+    </w:p>
+    <w:p>
+      <w:pPr>
+        <w:pStyle w:val="Heading2"/>
+      </w:pPr>
+      <w:r>
+        <w:rPr>
+          <w:rFonts w:ascii="Calibri" w:hAnsi="Calibri"/>
+          <w:color w:val="1F3A5F"/>
+        </w:rPr>
+        <w:t>7.1 Instalar como serviço do Windows</w:t>
+      </w:r>
+    </w:p>
+    <w:p>
+      <w:pPr>
+        <w:spacing w:after="120"/>
+      </w:pPr>
+      <w:r>
+        <w:t xml:space="preserve">Num prompt de administrador, na pasta publicada (ex.: </w:t>
+      </w:r>
+      <w:r>
+        <w:rPr>
+          <w:rFonts w:ascii="Consolas" w:hAnsi="Consolas"/>
+          <w:sz w:val="19"/>
+        </w:rPr>
+        <w:t>D:\Sites\services\staging\EmailIndexingService\publish</w:t>
+      </w:r>
+      <w:r>
+        <w:t>):</w:t>
+      </w:r>
+    </w:p>
+    <w:p>
+      <w:pPr>
+        <w:spacing w:before="0" w:after="0"/>
+        <w:ind w:left="170"/>
+        <w:shd w:val="clear" w:color="auto" w:fill="F2F2F2"/>
+      </w:pPr>
+      <w:r>
+        <w:rPr>
+          <w:rFonts w:ascii="Consolas" w:hAnsi="Consolas"/>
+          <w:sz w:val="18"/>
+        </w:rPr>
+        <w:t>EmailIndexingService.exe install -username "DOMINIO\usuario" -password "senha"</w:t>
+      </w:r>
+    </w:p>
+    <w:p>
+      <w:pPr>
+        <w:spacing w:before="0" w:after="0"/>
+        <w:ind w:left="170"/>
+        <w:shd w:val="clear" w:color="auto" w:fill="F2F2F2"/>
+      </w:pPr>
+      <w:r>
+        <w:rPr>
+          <w:rFonts w:ascii="Consolas" w:hAnsi="Consolas"/>
+          <w:sz w:val="18"/>
+        </w:rPr>
+        <w:t>EmailIndexingService.exe start</w:t>
+      </w:r>
+    </w:p>
+    <w:p>
+      <w:pPr>
+        <w:spacing w:after="40"/>
+      </w:pPr>
+    </w:p>
+    <w:p>
+      <w:pPr>
+        <w:spacing w:after="120"/>
+      </w:pPr>
+      <w:r>
+        <w:t xml:space="preserve">Usar uma conta com acesso ao SQL (as connection strings usam </w:t>
+      </w:r>
+      <w:r>
+        <w:rPr>
+          <w:rFonts w:ascii="Consolas" w:hAnsi="Consolas"/>
+          <w:sz w:val="19"/>
+        </w:rPr>
+        <w:t>Integrated Security</w:t>
+      </w:r>
+      <w:r>
+        <w:t xml:space="preserve">), com insert em </w:t>
+      </w:r>
+      <w:r>
+        <w:rPr>
+          <w:rFonts w:ascii="Consolas" w:hAnsi="Consolas"/>
+          <w:sz w:val="19"/>
+        </w:rPr>
+        <w:t>LogDB.dbo.Logs</w:t>
+      </w:r>
+      <w:r>
+        <w:t xml:space="preserve"> e escrita na pasta </w:t>
+      </w:r>
+      <w:r>
+        <w:rPr>
+          <w:rFonts w:ascii="Consolas" w:hAnsi="Consolas"/>
+          <w:sz w:val="19"/>
+        </w:rPr>
+        <w:t>Files.Temp</w:t>
+      </w:r>
+      <w:r>
+        <w:t xml:space="preserve">. Instalado como Local System, o acesso ao SQL vai pela conta da máquina e costuma falhar. Parar: </w:t>
+      </w:r>
+      <w:r>
+        <w:rPr>
+          <w:rFonts w:ascii="Consolas" w:hAnsi="Consolas"/>
+          <w:sz w:val="19"/>
+        </w:rPr>
+        <w:t>EmailIndexingService.exe stop</w:t>
+      </w:r>
+      <w:r>
+        <w:t xml:space="preserve">; remover: </w:t>
+      </w:r>
+      <w:r>
+        <w:rPr>
+          <w:rFonts w:ascii="Consolas" w:hAnsi="Consolas"/>
+          <w:sz w:val="19"/>
+        </w:rPr>
+        <w:t>EmailIndexingService.exe uninstall</w:t>
+      </w:r>
+      <w:r>
+        <w:t>. Antes de instalar, fechar qualquer execução manual (duas instâncias leriam a mesma caixa).</w:t>
       </w:r>
     </w:p>
     <w:p>
@@ -3159,6 +3666,190 @@
           </w:p>
         </w:tc>
       </w:tr>
+      <w:tr>
+        <w:tc>
+          <w:tcPr>
+            <w:tcW w:type="dxa" w:w="3685"/>
+          </w:tcPr>
+          <w:p>
+            <w:r/>
+            <w:r>
+              <w:t>"The ConnectionString property has not been initialized"</w:t>
+            </w:r>
+          </w:p>
+        </w:tc>
+        <w:tc>
+          <w:tcPr>
+            <w:tcW w:type="dxa" w:w="5669"/>
+          </w:tcPr>
+          <w:p>
+            <w:r/>
+            <w:r>
+              <w:t xml:space="preserve">nome da chave errado em </w:t>
+            </w:r>
+            <w:r>
+              <w:rPr>
+                <w:rFonts w:ascii="Consolas" w:hAnsi="Consolas"/>
+                <w:sz w:val="19"/>
+              </w:rPr>
+              <w:t>ConnectionStrings</w:t>
+            </w:r>
+            <w:r>
+              <w:t xml:space="preserve">: tem que ser </w:t>
+            </w:r>
+            <w:r>
+              <w:rPr>
+                <w:rFonts w:ascii="Consolas" w:hAnsi="Consolas"/>
+                <w:sz w:val="19"/>
+              </w:rPr>
+              <w:t>DefaultConnection</w:t>
+            </w:r>
+            <w:r>
+              <w:t xml:space="preserve"> ou </w:t>
+            </w:r>
+            <w:r>
+              <w:rPr>
+                <w:rFonts w:ascii="Consolas" w:hAnsi="Consolas"/>
+                <w:sz w:val="19"/>
+              </w:rPr>
+              <w:t>BRSCloudConnection</w:t>
+            </w:r>
+          </w:p>
+        </w:tc>
+      </w:tr>
+      <w:tr>
+        <w:tc>
+          <w:tcPr>
+            <w:tcW w:type="dxa" w:w="3685"/>
+          </w:tcPr>
+          <w:p>
+            <w:r/>
+            <w:r>
+              <w:t>"Critical failure while describing key ... via DPAPI"</w:t>
+            </w:r>
+          </w:p>
+        </w:tc>
+        <w:tc>
+          <w:tcPr>
+            <w:tcW w:type="dxa" w:w="5669"/>
+          </w:tcPr>
+          <w:p>
+            <w:r/>
+            <w:r>
+              <w:t xml:space="preserve">valor </w:t>
+            </w:r>
+            <w:r>
+              <w:rPr>
+                <w:rFonts w:ascii="Consolas" w:hAnsi="Consolas"/>
+                <w:sz w:val="19"/>
+              </w:rPr>
+              <w:t>AQAAANCM...</w:t>
+            </w:r>
+            <w:r>
+              <w:t xml:space="preserve"> criptografado em outra máquina ou com escopo de usuário: gerar de novo nesta máquina</w:t>
+            </w:r>
+          </w:p>
+        </w:tc>
+      </w:tr>
+      <w:tr>
+        <w:tc>
+          <w:tcPr>
+            <w:tcW w:type="dxa" w:w="3685"/>
+          </w:tcPr>
+          <w:p>
+            <w:r/>
+            <w:r>
+              <w:t xml:space="preserve">Nenhum arquivo de log / nada na </w:t>
+            </w:r>
+            <w:r>
+              <w:rPr>
+                <w:rFonts w:ascii="Consolas" w:hAnsi="Consolas"/>
+                <w:sz w:val="19"/>
+              </w:rPr>
+              <w:t>dbo.Logs</w:t>
+            </w:r>
+          </w:p>
+        </w:tc>
+        <w:tc>
+          <w:tcPr>
+            <w:tcW w:type="dxa" w:w="5669"/>
+          </w:tcPr>
+          <w:p>
+            <w:r/>
+            <w:r>
+              <w:rPr>
+                <w:rFonts w:ascii="Consolas" w:hAnsi="Consolas"/>
+                <w:sz w:val="19"/>
+              </w:rPr>
+              <w:t>NLog.config</w:t>
+            </w:r>
+            <w:r>
+              <w:t xml:space="preserve"> ausente, com </w:t>
+            </w:r>
+            <w:r>
+              <w:rPr>
+                <w:rFonts w:ascii="Consolas" w:hAnsi="Consolas"/>
+                <w:sz w:val="19"/>
+              </w:rPr>
+              <w:t>writeTo</w:t>
+            </w:r>
+            <w:r>
+              <w:t xml:space="preserve"> apontando para target inexistente, com </w:t>
+            </w:r>
+            <w:r>
+              <w:rPr>
+                <w:rFonts w:ascii="Consolas" w:hAnsi="Consolas"/>
+                <w:sz w:val="19"/>
+              </w:rPr>
+              <w:t>NLog.Web.AspNetCore</w:t>
+            </w:r>
+            <w:r>
+              <w:t xml:space="preserve">, ou conta sem acesso ao LogDB: ver </w:t>
+            </w:r>
+            <w:r>
+              <w:rPr>
+                <w:rFonts w:ascii="Consolas" w:hAnsi="Consolas"/>
+                <w:sz w:val="19"/>
+              </w:rPr>
+              <w:t>log\internal-nlog.txt</w:t>
+            </w:r>
+          </w:p>
+        </w:tc>
+      </w:tr>
+      <w:tr>
+        <w:tc>
+          <w:tcPr>
+            <w:tcW w:type="dxa" w:w="3685"/>
+          </w:tcPr>
+          <w:p>
+            <w:r/>
+            <w:r>
+              <w:t>"Hosting environment: Production" no início</w:t>
+            </w:r>
+          </w:p>
+        </w:tc>
+        <w:tc>
+          <w:tcPr>
+            <w:tcW w:type="dxa" w:w="5669"/>
+          </w:tcPr>
+          <w:p>
+            <w:r/>
+            <w:r>
+              <w:t xml:space="preserve">apenas rótulo do host; a configuração usa </w:t>
+            </w:r>
+            <w:r>
+              <w:rPr>
+                <w:rFonts w:ascii="Consolas" w:hAnsi="Consolas"/>
+                <w:sz w:val="19"/>
+              </w:rPr>
+              <w:t>DOTNET_ENVIRONMENT</w:t>
+            </w:r>
+            <w:r>
+              <w:t xml:space="preserve"> (sem ela, Development)</w:t>
+            </w:r>
+          </w:p>
+        </w:tc>
+      </w:tr>
     </w:tbl>
     <w:p>
       <w:pPr>

</xml_diff>